<commit_message>
Align questionnaire Markdown with Word source
</commit_message>
<xml_diff>
--- a/docs/discovery/questionario-validazione.docx
+++ b/docs/discovery/questionario-validazione.docx
@@ -38,13 +38,13 @@
       <w:pPr>
         <w:pStyle w:val="Heading2"/>
         <w:rPr>
-          <w:rFonts w:hint="eastAsia"/>
           <w:lang w:val="it-IT"/>
         </w:rPr>
       </w:pPr>
       <w:r>
         <w:rPr>
           <w:b w:val="0"/>
+          <w:lang w:val="it-IT"/>
         </w:rPr>
         <w:t>Questo questionario serve a comprendere come un agente immobiliare raccoglie, verifica e trasferisce le informazioni necessarie per preparare una scheda immobile prima della pubblicazione.</w:t>
       </w:r>
@@ -71,21 +71,31 @@
         </w:rPr>
       </w:pPr>
       <w:r>
-        <w:rPr>
-          <w:b w:val="0"/>
-        </w:rPr>
-        <w:t xml:space="preserve">Tempo stimato: </w:t>
+        <w:t xml:space="preserve">Tempo </w:t>
+      </w:r>
+      <w:proofErr w:type="spellStart"/>
+      <w:r>
+        <w:t>stimato</w:t>
+      </w:r>
+      <w:proofErr w:type="spellEnd"/>
+      <w:r>
+        <w:t xml:space="preserve">: </w:t>
       </w:r>
       <w:r>
         <w:rPr>
           <w:b/>
         </w:rPr>
-        <w:t>30-45 minuti</w:t>
-      </w:r>
-      <w:r>
-        <w:rPr>
-          <w:b w:val="0"/>
-        </w:rPr>
+        <w:t xml:space="preserve">30 </w:t>
+      </w:r>
+      <w:proofErr w:type="spellStart"/>
+      <w:r>
+        <w:rPr>
+          <w:b/>
+        </w:rPr>
+        <w:t>minuti</w:t>
+      </w:r>
+      <w:proofErr w:type="spellEnd"/>
+      <w:r>
         <w:t>.</w:t>
       </w:r>
     </w:p>
@@ -315,7 +325,7 @@
       </w:pPr>
       <w:r>
         <w:rPr>
-          <w:b w:val="0"/>
+          <w:lang w:val="it-IT"/>
         </w:rPr>
         <w:t>Partecipare è facoltativo: puoi saltare qualsiasi domanda o interrompere in qualunque momento.</w:t>
       </w:r>
@@ -323,13 +333,14 @@
     <w:p>
       <w:pPr>
         <w:rPr>
+          <w:rFonts w:hint="eastAsia"/>
           <w:b/>
           <w:lang w:val="it-IT"/>
         </w:rPr>
       </w:pPr>
       <w:r>
         <w:rPr>
-          <w:b w:val="0"/>
+          <w:lang w:val="it-IT"/>
         </w:rPr>
         <w:t>Chiediamo solo informazioni generali sul ruolo, sul processo e sugli strumenti usati. Non chiediamo documenti né dati che possano identificare persone o immobili.</w:t>
       </w:r>
@@ -337,42 +348,27 @@
     <w:p>
       <w:pPr>
         <w:rPr>
+          <w:lang w:val="it-IT"/>
+        </w:rPr>
+      </w:pPr>
+    </w:p>
+    <w:p>
+      <w:pPr>
+        <w:rPr>
+          <w:rFonts w:hint="eastAsia"/>
+          <w:lang w:val="it-IT"/>
+        </w:rPr>
+      </w:pPr>
+      <w:r>
+        <w:rPr>
           <w:b/>
           <w:lang w:val="it-IT"/>
         </w:rPr>
-      </w:pPr>
-      <w:r>
-        <w:rPr>
-          <w:b w:val="0"/>
-        </w:rPr>
-        <w:t>Le risposte saranno conservate fuori dal repository del progetto e viste solo da chi conduce la ricerca. Nei risultati non saranno riportati nomi, risposte grezze o dettagli che permettano di riconoscere facilmente una persona o un immobile.</w:t>
-      </w:r>
-    </w:p>
-    <w:p>
-      <w:pPr/>
-      <w:r>
-        <w:rPr>
-          <w:b w:val="0"/>
-        </w:rPr>
-        <w:t>Le risposte saranno cancellate entro 90 giorni dalla decisione se proseguire con il progetto e comunque non oltre 12 mesi dalla raccolta. Per correggere o ritirare una risposta, contatta chi ti ha consegnato il questionario indicando il codice del partecipante.</w:t>
-      </w:r>
-    </w:p>
-    <w:p>
-      <w:pPr>
-        <w:rPr>
-          <w:rFonts w:hint="eastAsia"/>
-          <w:lang w:val="it-IT"/>
-        </w:rPr>
-      </w:pPr>
-      <w:r>
-        <w:rPr>
-          <w:b/>
-        </w:rPr>
         <w:t xml:space="preserve">Versione e data: </w:t>
       </w:r>
       <w:r>
         <w:rPr>
-          <w:b w:val="0"/>
+          <w:lang w:val="it-IT"/>
         </w:rPr>
         <w:t>1.2 - 6 ottobre 2026</w:t>
       </w:r>
@@ -533,6 +529,7 @@
     <w:p>
       <w:pPr>
         <w:rPr>
+          <w:rFonts w:hint="eastAsia"/>
           <w:b/>
           <w:lang w:val="it-IT"/>
         </w:rPr>
@@ -620,79 +617,143 @@
     <w:p>
       <w:pPr>
         <w:rPr>
+          <w:rFonts w:hint="eastAsia"/>
           <w:b/>
           <w:lang w:val="it-IT"/>
         </w:rPr>
       </w:pPr>
     </w:p>
     <w:p>
-      <w:pPr/>
+      <w:pPr>
+        <w:rPr>
+          <w:rFonts w:hint="eastAsia"/>
+          <w:lang w:val="it-IT"/>
+        </w:rPr>
+      </w:pPr>
       <w:r>
         <w:rPr>
           <w:b/>
+          <w:lang w:val="it-IT"/>
         </w:rPr>
         <w:t>Dimensione dell'agenzia:</w:t>
       </w:r>
     </w:p>
     <w:p>
-      <w:pPr/>
-      <w:r>
-        <w:rPr>
-          <w:b w:val="0"/>
+      <w:pPr>
+        <w:rPr>
+          <w:rFonts w:hint="eastAsia"/>
+          <w:lang w:val="it-IT"/>
+        </w:rPr>
+      </w:pPr>
+      <w:r>
+        <w:rPr>
+          <w:lang w:val="it-IT"/>
         </w:rPr>
         <w:t>☐ 1 persona</w:t>
       </w:r>
     </w:p>
     <w:p>
-      <w:pPr/>
-      <w:r>
-        <w:rPr>
-          <w:b w:val="0"/>
+      <w:pPr>
+        <w:rPr>
+          <w:rFonts w:hint="eastAsia"/>
+          <w:lang w:val="it-IT"/>
+        </w:rPr>
+      </w:pPr>
+      <w:r>
+        <w:rPr>
+          <w:lang w:val="it-IT"/>
         </w:rPr>
         <w:t>☐ 2-5 persone</w:t>
       </w:r>
     </w:p>
     <w:p>
-      <w:pPr/>
-      <w:r>
-        <w:rPr>
-          <w:b w:val="0"/>
+      <w:pPr>
+        <w:rPr>
+          <w:rFonts w:hint="eastAsia"/>
+          <w:lang w:val="it-IT"/>
+        </w:rPr>
+      </w:pPr>
+      <w:r>
+        <w:rPr>
+          <w:lang w:val="it-IT"/>
         </w:rPr>
         <w:t>☐ 6-15 persone</w:t>
       </w:r>
     </w:p>
     <w:p>
-      <w:pPr/>
-      <w:r>
-        <w:rPr>
-          <w:b w:val="0"/>
+      <w:pPr>
+        <w:rPr>
+          <w:rFonts w:hint="eastAsia"/>
+          <w:lang w:val="it-IT"/>
+        </w:rPr>
+      </w:pPr>
+      <w:r>
+        <w:rPr>
+          <w:lang w:val="it-IT"/>
         </w:rPr>
         <w:t>☐ Oltre 15 persone</w:t>
       </w:r>
     </w:p>
     <w:p>
-      <w:pPr/>
-    </w:p>
-    <w:p>
-      <w:pPr/>
+      <w:pPr>
+        <w:rPr>
+          <w:rFonts w:hint="eastAsia"/>
+          <w:lang w:val="it-IT"/>
+        </w:rPr>
+      </w:pPr>
+    </w:p>
+    <w:p>
+      <w:pPr>
+        <w:rPr>
+          <w:rFonts w:hint="eastAsia"/>
+          <w:lang w:val="it-IT"/>
+        </w:rPr>
+      </w:pPr>
       <w:r>
         <w:rPr>
           <w:b/>
-        </w:rPr>
-        <w:t>Area geografica principale (solo regione o macro-area):</w:t>
-      </w:r>
-    </w:p>
-    <w:p>
-      <w:pPr/>
-      <w:r>
-        <w:rPr>
-          <w:b w:val="0"/>
+          <w:lang w:val="it-IT"/>
+        </w:rPr>
+        <w:t xml:space="preserve">Area geografica principale (solo regione o </w:t>
+      </w:r>
+      <w:proofErr w:type="gramStart"/>
+      <w:r>
+        <w:rPr>
+          <w:b/>
+          <w:lang w:val="it-IT"/>
+        </w:rPr>
+        <w:t>macro-area</w:t>
+      </w:r>
+      <w:proofErr w:type="gramEnd"/>
+      <w:r>
+        <w:rPr>
+          <w:b/>
+          <w:lang w:val="it-IT"/>
+        </w:rPr>
+        <w:t>):</w:t>
+      </w:r>
+    </w:p>
+    <w:p>
+      <w:pPr>
+        <w:rPr>
+          <w:rFonts w:hint="eastAsia"/>
+          <w:lang w:val="it-IT"/>
+        </w:rPr>
+      </w:pPr>
+      <w:r>
+        <w:rPr>
+          <w:lang w:val="it-IT"/>
         </w:rPr>
         <w:t>................................................................................</w:t>
       </w:r>
     </w:p>
     <w:p>
-      <w:pPr/>
+      <w:pPr>
+        <w:rPr>
+          <w:rFonts w:hint="eastAsia"/>
+          <w:lang w:val="it-IT"/>
+        </w:rPr>
+      </w:pPr>
     </w:p>
     <w:p>
       <w:pPr>
@@ -810,6 +871,7 @@
     <w:p>
       <w:pPr>
         <w:rPr>
+          <w:rFonts w:hint="eastAsia"/>
           <w:lang w:val="it-IT"/>
         </w:rPr>
       </w:pPr>
@@ -860,6 +922,7 @@
         </w:pBdr>
         <w:spacing w:after="140"/>
         <w:rPr>
+          <w:rFonts w:hint="eastAsia"/>
           <w:lang w:val="it-IT"/>
         </w:rPr>
       </w:pPr>
@@ -905,6 +968,7 @@
         </w:pBdr>
         <w:spacing w:after="140"/>
         <w:rPr>
+          <w:rFonts w:hint="eastAsia"/>
           <w:lang w:val="it-IT"/>
         </w:rPr>
       </w:pPr>
@@ -950,6 +1014,7 @@
         </w:pBdr>
         <w:spacing w:after="140"/>
         <w:rPr>
+          <w:rFonts w:hint="eastAsia"/>
           <w:lang w:val="it-IT"/>
         </w:rPr>
       </w:pPr>
@@ -995,6 +1060,7 @@
         </w:pBdr>
         <w:spacing w:after="140"/>
         <w:rPr>
+          <w:rFonts w:hint="eastAsia"/>
           <w:lang w:val="it-IT"/>
         </w:rPr>
       </w:pPr>
@@ -1094,6 +1160,7 @@
         </w:pBdr>
         <w:spacing w:after="140"/>
         <w:rPr>
+          <w:rFonts w:hint="eastAsia"/>
           <w:lang w:val="it-IT"/>
         </w:rPr>
       </w:pPr>
@@ -1120,13 +1187,15 @@
     <w:p>
       <w:pPr>
         <w:rPr>
-          <w:lang w:val="it-IT"/>
-        </w:rPr>
-      </w:pPr>
-    </w:p>
-    <w:p>
-      <w:pPr>
-        <w:rPr>
+          <w:rFonts w:hint="eastAsia"/>
+          <w:lang w:val="it-IT"/>
+        </w:rPr>
+      </w:pPr>
+    </w:p>
+    <w:p>
+      <w:pPr>
+        <w:rPr>
+          <w:rFonts w:hint="eastAsia"/>
           <w:lang w:val="it-IT"/>
         </w:rPr>
       </w:pPr>
@@ -1213,62 +1282,63 @@
       <w:pPr>
         <w:pStyle w:val="Heading2"/>
         <w:rPr>
+          <w:rFonts w:ascii="Liberation Sans" w:hAnsi="Liberation Sans" w:hint="eastAsia"/>
+          <w:b w:val="0"/>
+          <w:lang w:val="it-IT"/>
+        </w:rPr>
+      </w:pPr>
+    </w:p>
+    <w:p>
+      <w:pPr>
+        <w:pStyle w:val="Heading2"/>
+        <w:rPr>
+          <w:rFonts w:ascii="Liberation Sans" w:hAnsi="Liberation Sans" w:hint="eastAsia"/>
+          <w:b w:val="0"/>
+          <w:lang w:val="it-IT"/>
+        </w:rPr>
+      </w:pPr>
+    </w:p>
+    <w:p>
+      <w:pPr>
+        <w:pStyle w:val="Heading2"/>
+        <w:rPr>
+          <w:rFonts w:ascii="Liberation Sans" w:hAnsi="Liberation Sans" w:hint="eastAsia"/>
+          <w:b w:val="0"/>
+          <w:lang w:val="it-IT"/>
+        </w:rPr>
+      </w:pPr>
+    </w:p>
+    <w:p>
+      <w:pPr>
+        <w:pStyle w:val="Heading2"/>
+        <w:rPr>
+          <w:rFonts w:ascii="Liberation Sans" w:hAnsi="Liberation Sans" w:hint="eastAsia"/>
+          <w:b w:val="0"/>
+          <w:lang w:val="it-IT"/>
+        </w:rPr>
+      </w:pPr>
+    </w:p>
+    <w:p>
+      <w:pPr>
+        <w:rPr>
+          <w:rFonts w:hint="eastAsia"/>
+          <w:lang w:val="it-IT"/>
+        </w:rPr>
+      </w:pPr>
+    </w:p>
+    <w:p>
+      <w:pPr>
+        <w:pStyle w:val="Heading2"/>
+        <w:rPr>
+          <w:lang w:val="it-IT"/>
+        </w:rPr>
+      </w:pPr>
+      <w:r>
+        <w:rPr>
           <w:rFonts w:ascii="Liberation Sans" w:hAnsi="Liberation Sans"/>
           <w:b w:val="0"/>
           <w:lang w:val="it-IT"/>
         </w:rPr>
-      </w:pPr>
-    </w:p>
-    <w:p>
-      <w:pPr>
-        <w:pStyle w:val="Heading2"/>
-        <w:rPr>
-          <w:rFonts w:ascii="Liberation Sans" w:hAnsi="Liberation Sans"/>
-          <w:b w:val="0"/>
-          <w:lang w:val="it-IT"/>
-        </w:rPr>
-      </w:pPr>
-    </w:p>
-    <w:p>
-      <w:pPr>
-        <w:pStyle w:val="Heading2"/>
-        <w:rPr>
-          <w:rFonts w:ascii="Liberation Sans" w:hAnsi="Liberation Sans"/>
-          <w:b w:val="0"/>
-          <w:lang w:val="it-IT"/>
-        </w:rPr>
-      </w:pPr>
-    </w:p>
-    <w:p>
-      <w:pPr>
-        <w:pStyle w:val="Heading2"/>
-        <w:rPr>
-          <w:rFonts w:ascii="Liberation Sans" w:hAnsi="Liberation Sans"/>
-          <w:b w:val="0"/>
-          <w:lang w:val="it-IT"/>
-        </w:rPr>
-      </w:pPr>
-    </w:p>
-    <w:p>
-      <w:pPr>
-        <w:rPr>
-          <w:lang w:val="it-IT"/>
-        </w:rPr>
-      </w:pPr>
-    </w:p>
-    <w:p>
-      <w:pPr>
-        <w:pStyle w:val="Heading2"/>
-        <w:rPr>
-          <w:lang w:val="it-IT"/>
-        </w:rPr>
-      </w:pPr>
-      <w:r>
-        <w:rPr>
-          <w:rFonts w:ascii="Liberation Sans" w:hAnsi="Liberation Sans"/>
-          <w:b w:val="0"/>
-          <w:lang w:val="it-IT"/>
-        </w:rPr>
         <w:lastRenderedPageBreak/>
         <w:t>2.2 Strumenti utilizzati</w:t>
       </w:r>
@@ -1466,6 +1536,7 @@
     <w:p>
       <w:pPr>
         <w:rPr>
+          <w:rFonts w:hint="eastAsia"/>
           <w:lang w:val="it-IT"/>
         </w:rPr>
       </w:pPr>
@@ -1583,6 +1654,7 @@
     <w:p>
       <w:pPr>
         <w:rPr>
+          <w:rFonts w:hint="eastAsia"/>
           <w:lang w:val="it-IT"/>
         </w:rPr>
       </w:pPr>
@@ -1642,6 +1714,7 @@
     <w:p>
       <w:pPr>
         <w:rPr>
+          <w:rFonts w:hint="eastAsia"/>
           <w:lang w:val="it-IT"/>
         </w:rPr>
       </w:pPr>
@@ -1682,6 +1755,7 @@
     <w:p>
       <w:pPr>
         <w:rPr>
+          <w:rFonts w:hint="eastAsia"/>
           <w:lang w:val="it-IT"/>
         </w:rPr>
       </w:pPr>
@@ -1833,6 +1907,7 @@
     <w:p>
       <w:pPr>
         <w:rPr>
+          <w:rFonts w:hint="eastAsia"/>
           <w:b/>
           <w:lang w:val="it-IT"/>
         </w:rPr>
@@ -1881,6 +1956,7 @@
     <w:p>
       <w:pPr>
         <w:rPr>
+          <w:rFonts w:hint="eastAsia"/>
           <w:lang w:val="it-IT"/>
         </w:rPr>
       </w:pPr>
@@ -1940,6 +2016,7 @@
     <w:p>
       <w:pPr>
         <w:rPr>
+          <w:rFonts w:hint="eastAsia"/>
           <w:lang w:val="it-IT"/>
         </w:rPr>
       </w:pPr>
@@ -2000,51 +2077,52 @@
       <w:pPr>
         <w:pStyle w:val="Heading2"/>
         <w:rPr>
+          <w:rFonts w:ascii="Liberation Sans" w:hAnsi="Liberation Sans" w:hint="eastAsia"/>
+          <w:b w:val="0"/>
+          <w:lang w:val="it-IT"/>
+        </w:rPr>
+      </w:pPr>
+    </w:p>
+    <w:p>
+      <w:pPr>
+        <w:pStyle w:val="Heading2"/>
+        <w:rPr>
+          <w:rFonts w:ascii="Liberation Sans" w:hAnsi="Liberation Sans" w:hint="eastAsia"/>
+          <w:b w:val="0"/>
+          <w:lang w:val="it-IT"/>
+        </w:rPr>
+      </w:pPr>
+    </w:p>
+    <w:p>
+      <w:pPr>
+        <w:pStyle w:val="Heading2"/>
+        <w:rPr>
+          <w:rFonts w:ascii="Liberation Sans" w:hAnsi="Liberation Sans" w:hint="eastAsia"/>
+          <w:b w:val="0"/>
+          <w:lang w:val="it-IT"/>
+        </w:rPr>
+      </w:pPr>
+    </w:p>
+    <w:p>
+      <w:pPr>
+        <w:pStyle w:val="Heading2"/>
+        <w:rPr>
+          <w:lang w:val="it-IT"/>
+        </w:rPr>
+      </w:pPr>
+      <w:r>
+        <w:rPr>
           <w:rFonts w:ascii="Liberation Sans" w:hAnsi="Liberation Sans"/>
           <w:b w:val="0"/>
           <w:lang w:val="it-IT"/>
         </w:rPr>
-      </w:pPr>
-    </w:p>
-    <w:p>
-      <w:pPr>
-        <w:pStyle w:val="Heading2"/>
-        <w:rPr>
-          <w:rFonts w:ascii="Liberation Sans" w:hAnsi="Liberation Sans"/>
-          <w:b w:val="0"/>
-          <w:lang w:val="it-IT"/>
-        </w:rPr>
-      </w:pPr>
-    </w:p>
-    <w:p>
-      <w:pPr>
-        <w:pStyle w:val="Heading2"/>
-        <w:rPr>
-          <w:rFonts w:ascii="Liberation Sans" w:hAnsi="Liberation Sans"/>
-          <w:b w:val="0"/>
-          <w:lang w:val="it-IT"/>
-        </w:rPr>
-      </w:pPr>
-    </w:p>
-    <w:p>
-      <w:pPr>
-        <w:pStyle w:val="Heading2"/>
-        <w:rPr>
-          <w:lang w:val="it-IT"/>
-        </w:rPr>
-      </w:pPr>
-      <w:r>
-        <w:rPr>
-          <w:rFonts w:ascii="Liberation Sans" w:hAnsi="Liberation Sans"/>
-          <w:b w:val="0"/>
-          <w:lang w:val="it-IT"/>
-        </w:rPr>
         <w:t>2.3 Tempi e frequenza dei problemi</w:t>
       </w:r>
     </w:p>
     <w:p>
       <w:pPr>
         <w:rPr>
+          <w:rFonts w:hint="eastAsia"/>
           <w:lang w:val="it-IT"/>
         </w:rPr>
       </w:pPr>
@@ -2162,6 +2240,7 @@
     <w:p>
       <w:pPr>
         <w:rPr>
+          <w:rFonts w:hint="eastAsia"/>
           <w:lang w:val="it-IT"/>
         </w:rPr>
       </w:pPr>
@@ -2263,6 +2342,7 @@
     <w:p>
       <w:pPr>
         <w:rPr>
+          <w:rFonts w:hint="eastAsia"/>
           <w:lang w:val="it-IT"/>
         </w:rPr>
       </w:pPr>
@@ -2365,6 +2445,7 @@
     <w:p>
       <w:pPr>
         <w:rPr>
+          <w:rFonts w:hint="eastAsia"/>
           <w:lang w:val="it-IT"/>
         </w:rPr>
       </w:pPr>
@@ -2495,6 +2576,7 @@
     <w:p>
       <w:pPr>
         <w:rPr>
+          <w:rFonts w:hint="eastAsia"/>
           <w:lang w:val="it-IT"/>
         </w:rPr>
       </w:pPr>
@@ -5215,6 +5297,7 @@
     <w:p>
       <w:pPr>
         <w:rPr>
+          <w:rFonts w:hint="eastAsia"/>
           <w:lang w:val="it-IT"/>
         </w:rPr>
       </w:pPr>
@@ -5293,6 +5376,7 @@
     <w:p>
       <w:pPr>
         <w:rPr>
+          <w:rFonts w:hint="eastAsia"/>
           <w:lang w:val="it-IT"/>
         </w:rPr>
       </w:pPr>
@@ -5353,7 +5437,7 @@
       <w:pPr>
         <w:pStyle w:val="Heading2"/>
         <w:rPr>
-          <w:rFonts w:ascii="Liberation Sans" w:hAnsi="Liberation Sans"/>
+          <w:rFonts w:ascii="Liberation Sans" w:hAnsi="Liberation Sans" w:hint="eastAsia"/>
           <w:b w:val="0"/>
           <w:lang w:val="it-IT"/>
         </w:rPr>
@@ -5362,6 +5446,7 @@
     <w:p>
       <w:pPr>
         <w:rPr>
+          <w:rFonts w:hint="eastAsia"/>
           <w:lang w:val="it-IT"/>
         </w:rPr>
       </w:pPr>
@@ -5536,25 +5621,7 @@
                 <w:sz w:val="15"/>
                 <w:lang w:val="it-IT"/>
               </w:rPr>
-              <w:t>Copiato manualmente</w:t>
-            </w:r>
-            <w:r>
-              <w:rPr>
-                <w:b/>
-                <w:color w:val="FFFFFF"/>
-                <w:sz w:val="15"/>
-                <w:lang w:val="it-IT"/>
-              </w:rPr>
-              <w:t xml:space="preserve"> nella cartella/gestionale</w:t>
-            </w:r>
-            <w:r>
-              <w:rPr>
-                <w:b/>
-                <w:color w:val="FFFFFF"/>
-                <w:sz w:val="15"/>
-                <w:lang w:val="it-IT"/>
-              </w:rPr>
-              <w:t>?</w:t>
+              <w:t>Copiato manualmente nella cartella/gestionale?</w:t>
             </w:r>
           </w:p>
         </w:tc>
@@ -7170,20 +7237,23 @@
     <w:p>
       <w:pPr>
         <w:rPr>
-          <w:lang w:val="it-IT"/>
-        </w:rPr>
-      </w:pPr>
-    </w:p>
-    <w:p>
-      <w:pPr>
-        <w:rPr>
-          <w:lang w:val="it-IT"/>
-        </w:rPr>
-      </w:pPr>
-    </w:p>
-    <w:p>
-      <w:pPr>
-        <w:rPr>
+          <w:rFonts w:hint="eastAsia"/>
+          <w:lang w:val="it-IT"/>
+        </w:rPr>
+      </w:pPr>
+    </w:p>
+    <w:p>
+      <w:pPr>
+        <w:rPr>
+          <w:rFonts w:hint="eastAsia"/>
+          <w:lang w:val="it-IT"/>
+        </w:rPr>
+      </w:pPr>
+    </w:p>
+    <w:p>
+      <w:pPr>
+        <w:rPr>
+          <w:rFonts w:hint="eastAsia"/>
           <w:lang w:val="it-IT"/>
         </w:rPr>
       </w:pPr>
@@ -7245,7 +7315,7 @@
       <w:pPr>
         <w:pStyle w:val="Heading2"/>
         <w:rPr>
-          <w:rFonts w:ascii="Liberation Sans" w:hAnsi="Liberation Sans"/>
+          <w:rFonts w:ascii="Liberation Sans" w:hAnsi="Liberation Sans" w:hint="eastAsia"/>
           <w:b w:val="0"/>
           <w:lang w:val="it-IT"/>
         </w:rPr>
@@ -7255,7 +7325,7 @@
       <w:pPr>
         <w:pStyle w:val="Heading2"/>
         <w:rPr>
-          <w:rFonts w:ascii="Liberation Sans" w:hAnsi="Liberation Sans"/>
+          <w:rFonts w:ascii="Liberation Sans" w:hAnsi="Liberation Sans" w:hint="eastAsia"/>
           <w:b w:val="0"/>
           <w:lang w:val="it-IT"/>
         </w:rPr>
@@ -7496,6 +7566,7 @@
         <w:keepNext/>
         <w:spacing w:before="160"/>
         <w:rPr>
+          <w:rFonts w:hint="eastAsia"/>
           <w:b/>
           <w:lang w:val="it-IT"/>
         </w:rPr>
@@ -7679,6 +7750,7 @@
         <w:keepNext/>
         <w:spacing w:before="160"/>
         <w:rPr>
+          <w:rFonts w:hint="eastAsia"/>
           <w:b/>
           <w:lang w:val="it-IT"/>
         </w:rPr>
@@ -7863,6 +7935,7 @@
         <w:keepNext/>
         <w:spacing w:before="160"/>
         <w:rPr>
+          <w:rFonts w:hint="eastAsia"/>
           <w:b/>
           <w:lang w:val="it-IT"/>
         </w:rPr>
@@ -8046,6 +8119,7 @@
         <w:keepNext/>
         <w:spacing w:before="160"/>
         <w:rPr>
+          <w:rFonts w:hint="eastAsia"/>
           <w:b/>
           <w:lang w:val="it-IT"/>
         </w:rPr>
@@ -8227,6 +8301,7 @@
     <w:p>
       <w:pPr>
         <w:rPr>
+          <w:rFonts w:hint="eastAsia"/>
           <w:lang w:val="it-IT"/>
         </w:rPr>
       </w:pPr>
@@ -8351,6 +8426,7 @@
     <w:p>
       <w:pPr>
         <w:rPr>
+          <w:rFonts w:hint="eastAsia"/>
           <w:lang w:val="it-IT"/>
         </w:rPr>
       </w:pPr>
@@ -8436,19 +8512,7 @@
         <w:rPr>
           <w:lang w:val="it-IT"/>
         </w:rPr>
-        <w:t>Descrivere</w:t>
-      </w:r>
-      <w:r>
-        <w:rPr>
-          <w:lang w:val="it-IT"/>
-        </w:rPr>
-        <w:t xml:space="preserve"> un massimo di</w:t>
-      </w:r>
-      <w:r>
-        <w:rPr>
-          <w:lang w:val="it-IT"/>
-        </w:rPr>
-        <w:t xml:space="preserve"> tre casi recenti o rappresentativi. Non usare necessariamente i casi più problematici: servono anche casi normali. Non inserire dati identificativi.</w:t>
+        <w:t>Descrivere un massimo di tre casi recenti o rappresentativi. Non usare necessariamente i casi più problematici: servono anche casi normali. Non inserire dati identificativi.</w:t>
       </w:r>
     </w:p>
     <w:p>
@@ -8904,7 +8968,7 @@
       <w:pPr>
         <w:pStyle w:val="Heading2"/>
         <w:rPr>
-          <w:rFonts w:ascii="Liberation Sans" w:hAnsi="Liberation Sans"/>
+          <w:rFonts w:ascii="Liberation Sans" w:hAnsi="Liberation Sans" w:hint="eastAsia"/>
           <w:b w:val="0"/>
           <w:lang w:val="it-IT"/>
         </w:rPr>
@@ -9358,7 +9422,7 @@
       <w:pPr>
         <w:pStyle w:val="Heading2"/>
         <w:rPr>
-          <w:rFonts w:ascii="Liberation Sans" w:hAnsi="Liberation Sans"/>
+          <w:rFonts w:ascii="Liberation Sans" w:hAnsi="Liberation Sans" w:hint="eastAsia"/>
           <w:b w:val="0"/>
           <w:lang w:val="it-IT"/>
         </w:rPr>
@@ -9965,6 +10029,7 @@
     <w:p>
       <w:pPr>
         <w:rPr>
+          <w:rFonts w:hint="eastAsia"/>
           <w:lang w:val="it-IT"/>
         </w:rPr>
       </w:pPr>
@@ -10112,6 +10177,7 @@
     <w:p>
       <w:pPr>
         <w:rPr>
+          <w:rFonts w:hint="eastAsia"/>
           <w:lang w:val="it-IT"/>
         </w:rPr>
       </w:pPr>
@@ -10152,6 +10218,7 @@
     <w:p>
       <w:pPr>
         <w:rPr>
+          <w:rFonts w:hint="eastAsia"/>
           <w:lang w:val="it-IT"/>
         </w:rPr>
       </w:pPr>
@@ -10253,6 +10320,7 @@
     <w:p>
       <w:pPr>
         <w:rPr>
+          <w:rFonts w:hint="eastAsia"/>
           <w:lang w:val="it-IT"/>
         </w:rPr>
       </w:pPr>
@@ -10293,6 +10361,7 @@
     <w:p>
       <w:pPr>
         <w:rPr>
+          <w:rFonts w:hint="eastAsia"/>
           <w:lang w:val="it-IT"/>
         </w:rPr>
       </w:pPr>
@@ -10333,6 +10402,7 @@
     <w:p>
       <w:pPr>
         <w:rPr>
+          <w:rFonts w:hint="eastAsia"/>
           <w:lang w:val="it-IT"/>
         </w:rPr>
       </w:pPr>
@@ -10373,6 +10443,7 @@
     <w:p>
       <w:pPr>
         <w:rPr>
+          <w:rFonts w:hint="eastAsia"/>
           <w:lang w:val="it-IT"/>
         </w:rPr>
       </w:pPr>
@@ -10475,6 +10546,7 @@
     <w:p>
       <w:pPr>
         <w:rPr>
+          <w:rFonts w:hint="eastAsia"/>
           <w:lang w:val="it-IT"/>
         </w:rPr>
       </w:pPr>
@@ -10544,6 +10616,7 @@
     <w:p>
       <w:pPr>
         <w:rPr>
+          <w:rFonts w:hint="eastAsia"/>
           <w:lang w:val="it-IT"/>
         </w:rPr>
       </w:pPr>
@@ -10613,6 +10686,7 @@
     <w:p>
       <w:pPr>
         <w:rPr>
+          <w:rFonts w:hint="eastAsia"/>
           <w:lang w:val="it-IT"/>
         </w:rPr>
       </w:pPr>
@@ -10682,69 +10756,110 @@
     <w:p>
       <w:pPr>
         <w:rPr>
-          <w:lang w:val="it-IT"/>
-        </w:rPr>
-      </w:pPr>
-    </w:p>
-    <w:p>
-      <w:pPr/>
-      <w:r>
-        <w:rPr>
-          <w:b w:val="0"/>
+          <w:rFonts w:hint="eastAsia"/>
+          <w:lang w:val="it-IT"/>
+        </w:rPr>
+      </w:pPr>
+    </w:p>
+    <w:p>
+      <w:pPr>
+        <w:rPr>
+          <w:rFonts w:hint="eastAsia"/>
+          <w:lang w:val="it-IT"/>
+        </w:rPr>
+      </w:pPr>
+      <w:r>
+        <w:rPr>
+          <w:lang w:val="it-IT"/>
         </w:rPr>
         <w:t>Pensando a uno dei casi descritti, sarebbe possibile creare un esempio inventato che mantenga gli stessi problemi (per esempio documenti mancanti, dati diversi tra documenti o scansioni poco leggibili), senza usare dati, documenti o planimetrie di immobili reali?</w:t>
       </w:r>
     </w:p>
     <w:p>
-      <w:pPr/>
-      <w:r>
-        <w:rPr>
-          <w:b w:val="0"/>
+      <w:pPr>
+        <w:rPr>
+          <w:rFonts w:hint="eastAsia"/>
+          <w:lang w:val="it-IT"/>
+        </w:rPr>
+      </w:pPr>
+      <w:r>
+        <w:rPr>
+          <w:lang w:val="it-IT"/>
         </w:rPr>
         <w:t>☐ Sì</w:t>
       </w:r>
     </w:p>
     <w:p>
-      <w:pPr/>
-      <w:r>
-        <w:rPr>
-          <w:b w:val="0"/>
+      <w:pPr>
+        <w:rPr>
+          <w:rFonts w:hint="eastAsia"/>
+          <w:lang w:val="it-IT"/>
+        </w:rPr>
+      </w:pPr>
+      <w:r>
+        <w:rPr>
+          <w:lang w:val="it-IT"/>
         </w:rPr>
         <w:t>☐ Forse, ma sarebbe difficile per questi motivi: ..........................</w:t>
       </w:r>
     </w:p>
     <w:p>
-      <w:pPr/>
-      <w:r>
-        <w:rPr>
-          <w:b w:val="0"/>
+      <w:pPr>
+        <w:rPr>
+          <w:rFonts w:hint="eastAsia"/>
+          <w:lang w:val="it-IT"/>
+        </w:rPr>
+      </w:pPr>
+      <w:r>
+        <w:rPr>
+          <w:lang w:val="it-IT"/>
         </w:rPr>
         <w:t>☐ No, perché: ..............................................................</w:t>
       </w:r>
     </w:p>
     <w:p>
-      <w:pPr/>
-    </w:p>
-    <w:p>
-      <w:pPr/>
-      <w:r>
-        <w:rPr>
-          <w:b w:val="0"/>
+      <w:pPr>
+        <w:rPr>
+          <w:rFonts w:hint="eastAsia"/>
+          <w:lang w:val="it-IT"/>
+        </w:rPr>
+      </w:pPr>
+    </w:p>
+    <w:p>
+      <w:pPr>
+        <w:rPr>
+          <w:rFonts w:hint="eastAsia"/>
+          <w:lang w:val="it-IT"/>
+        </w:rPr>
+      </w:pPr>
+      <w:r>
+        <w:rPr>
+          <w:lang w:val="it-IT"/>
         </w:rPr>
         <w:t>Quali problemi sarebbe importante riprodurre nell'esempio?</w:t>
       </w:r>
     </w:p>
     <w:p>
-      <w:pPr/>
-      <w:r>
-        <w:rPr>
-          <w:b w:val="0"/>
+      <w:pPr>
+        <w:rPr>
+          <w:rFonts w:hint="eastAsia"/>
+          <w:lang w:val="it-IT"/>
+        </w:rPr>
+      </w:pPr>
+      <w:r>
+        <w:rPr>
+          <w:lang w:val="it-IT"/>
         </w:rPr>
         <w:t>................................................................................</w:t>
       </w:r>
     </w:p>
     <w:p>
-      <w:pPr/>
+      <w:pPr>
+        <w:rPr>
+          <w:rFonts w:hint="eastAsia"/>
+          <w:lang w:val="it-IT"/>
+        </w:rPr>
+      </w:pPr>
     </w:p>
     <w:p>
       <w:pPr>
@@ -10758,6 +10873,7 @@
         <w:rPr>
           <w:lang w:val="it-IT"/>
         </w:rPr>
+        <w:lastRenderedPageBreak/>
         <w:t>Sareste disponibili, in una fase successiva e solo dopo adeguate misure di sicurezza e privacy, a valutare un test limitato con documenti autorizzati?</w:t>
       </w:r>
     </w:p>
@@ -10828,6 +10944,7 @@
     <w:p>
       <w:pPr>
         <w:rPr>
+          <w:rFonts w:hint="eastAsia"/>
           <w:lang w:val="it-IT"/>
         </w:rPr>
       </w:pPr>
@@ -10938,6 +11055,7 @@
     <w:p>
       <w:pPr>
         <w:rPr>
+          <w:rFonts w:hint="eastAsia"/>
           <w:lang w:val="it-IT"/>
         </w:rPr>
       </w:pPr>
@@ -10978,6 +11096,7 @@
     <w:p>
       <w:pPr>
         <w:rPr>
+          <w:rFonts w:hint="eastAsia"/>
           <w:lang w:val="it-IT"/>
         </w:rPr>
       </w:pPr>
@@ -11131,6 +11250,7 @@
     <w:p>
       <w:pPr>
         <w:rPr>
+          <w:rFonts w:hint="eastAsia"/>
           <w:b/>
           <w:lang w:val="it-IT"/>
         </w:rPr>
@@ -11198,6 +11318,7 @@
     <w:p>
       <w:pPr>
         <w:rPr>
+          <w:rFonts w:hint="eastAsia"/>
           <w:b/>
           <w:lang w:val="it-IT"/>
         </w:rPr>
@@ -11227,35 +11348,31 @@
     <w:p>
       <w:pPr>
         <w:rPr>
-          <w:lang w:val="it-IT"/>
-        </w:rPr>
-      </w:pPr>
-    </w:p>
-    <w:p>
-      <w:pPr>
-        <w:rPr>
-          <w:lang w:val="it-IT"/>
-        </w:rPr>
-      </w:pPr>
-    </w:p>
-    <w:p>
-      <w:pPr>
-        <w:rPr>
-          <w:rFonts w:hint="eastAsia"/>
-          <w:lang w:val="it-IT"/>
-        </w:rPr>
-      </w:pPr>
-      <w:r>
-        <w:rPr>
-          <w:lang w:val="it-IT"/>
-        </w:rPr>
-        <w:t>Grazie per il contributo</w:t>
-      </w:r>
-      <w:r>
-        <w:rPr>
-          <w:lang w:val="it-IT"/>
-        </w:rPr>
-        <w:t>!</w:t>
+          <w:rFonts w:hint="eastAsia"/>
+          <w:lang w:val="it-IT"/>
+        </w:rPr>
+      </w:pPr>
+    </w:p>
+    <w:p>
+      <w:pPr>
+        <w:rPr>
+          <w:rFonts w:hint="eastAsia"/>
+          <w:lang w:val="it-IT"/>
+        </w:rPr>
+      </w:pPr>
+    </w:p>
+    <w:p>
+      <w:pPr>
+        <w:rPr>
+          <w:rFonts w:hint="eastAsia"/>
+          <w:lang w:val="it-IT"/>
+        </w:rPr>
+      </w:pPr>
+      <w:r>
+        <w:rPr>
+          <w:lang w:val="it-IT"/>
+        </w:rPr>
+        <w:t>Grazie per il contributo!</w:t>
       </w:r>
     </w:p>
     <w:p>
@@ -11287,7 +11404,7 @@
       </w:pPr>
       <w:r>
         <w:rPr>
-          <w:b w:val="0"/>
+          <w:lang w:val="it-IT"/>
         </w:rPr>
         <w:t>1. Prima di iniziare, ricordare che la partecipazione è facoltativa, spiegare come saranno usate le risposte e chiedere se la persona desidera continuare; è sufficiente una conferma verbale. Verificare se l'agenzia richiede un'informativa privacy aggiuntiva.</w:t>
       </w:r>
@@ -11351,9 +11468,23 @@
       </w:pPr>
       <w:r>
         <w:rPr>
-          <w:b w:val="0"/>
-        </w:rPr>
-        <w:t>5. Conservare, limitare l'accesso, usare, rettificare e cancellare le risposte secondo le indicazioni nella sezione Prima di iniziare. Registrare ogni richiesta di ritiro o cancellazione tramite il codice del partecipante.</w:t>
+          <w:lang w:val="it-IT"/>
+        </w:rPr>
+        <w:t xml:space="preserve">5. Conservare, limitare l'accesso, usare, rettificare e cancellare le risposte secondo le indicazioni nella </w:t>
+      </w:r>
+      <w:proofErr w:type="gramStart"/>
+      <w:r>
+        <w:rPr>
+          <w:lang w:val="it-IT"/>
+        </w:rPr>
+        <w:t>sezione</w:t>
+      </w:r>
+      <w:proofErr w:type="gramEnd"/>
+      <w:r>
+        <w:rPr>
+          <w:lang w:val="it-IT"/>
+        </w:rPr>
+        <w:t xml:space="preserve"> Prima di iniziare. Registrare ogni richiesta di ritiro o cancellazione tramite il codice del partecipante.</w:t>
       </w:r>
     </w:p>
     <w:p>
@@ -11362,6 +11493,7 @@
         <w:ind w:left="403" w:hanging="403"/>
         <w:rPr>
           <w:rFonts w:hint="eastAsia"/>
+          <w:lang w:val="it-IT"/>
         </w:rPr>
       </w:pPr>
       <w:r>
@@ -11371,47 +11503,36 @@
         <w:t xml:space="preserve">6.  Nei risultati usare solo conteggi, temi aggregati e descrizioni non identificative. </w:t>
       </w:r>
       <w:r>
-        <w:t xml:space="preserve">Non </w:t>
-      </w:r>
-      <w:proofErr w:type="spellStart"/>
-      <w:r>
-        <w:t>pubblicare</w:t>
-      </w:r>
-      <w:proofErr w:type="spellEnd"/>
-      <w:r>
-        <w:t xml:space="preserve"> </w:t>
-      </w:r>
-      <w:proofErr w:type="spellStart"/>
-      <w:r>
-        <w:t>risposte</w:t>
-      </w:r>
-      <w:proofErr w:type="spellEnd"/>
-      <w:r>
-        <w:t xml:space="preserve"> </w:t>
-      </w:r>
-      <w:proofErr w:type="spellStart"/>
-      <w:r>
-        <w:t>grezze</w:t>
-      </w:r>
-      <w:proofErr w:type="spellEnd"/>
-      <w:r>
-        <w:t xml:space="preserve"> o dettagli commercialmente sensibili dell'agenzia.</w:t>
-      </w:r>
-    </w:p>
-    <w:p>
-      <w:pPr/>
-      <w:r>
-        <w:rPr>
-          <w:b w:val="0"/>
+        <w:rPr>
+          <w:lang w:val="it-IT"/>
+        </w:rPr>
+        <w:t>Non pubblicare risposte grezze o dettagli commercialmente sensibili dell'agenzia.</w:t>
+      </w:r>
+    </w:p>
+    <w:p>
+      <w:pPr>
+        <w:rPr>
+          <w:rFonts w:hint="eastAsia"/>
+          <w:lang w:val="it-IT"/>
+        </w:rPr>
+      </w:pPr>
+      <w:r>
+        <w:rPr>
+          <w:lang w:val="it-IT"/>
         </w:rPr>
         <w:t>7. Con l'autorizzazione dell'agenzia, osservare una breve dimostrazione del gestionale e dei portali usando un immobile fittizio o schermate prive di dati reali. Se non è possibile, ricostruire i passaggi a voce senza mostrare dati riservati.</w:t>
       </w:r>
     </w:p>
     <w:p>
-      <w:pPr/>
-      <w:r>
-        <w:rPr>
-          <w:b w:val="0"/>
+      <w:pPr>
+        <w:rPr>
+          <w:rFonts w:hint="eastAsia"/>
+          <w:lang w:val="it-IT"/>
+        </w:rPr>
+      </w:pPr>
+      <w:r>
+        <w:rPr>
+          <w:lang w:val="it-IT"/>
         </w:rPr>
         <w:t>8. Tenere un conteggio separato delle interviste e dei casi raccolti. Prima della decisione finale servono almeno cinque interviste e 15 casi; se un partecipante descrive meno di tre casi, raccoglierne altri separatamente.</w:t>
       </w:r>
@@ -11500,7 +11621,6 @@
     </w:r>
     <w:r>
       <w:rPr>
-        <w:rFonts w:hint="eastAsia"/>
         <w:color w:val="5A5A5A"/>
         <w:sz w:val="16"/>
       </w:rPr>

</xml_diff>